<commit_message>
build: full rebuild of all submission deliverables (57 files)
- Rebuild all DOCX in dist/HO_SO_NOP/ from latest markdown sources:
  chapters 1-5, tóm tắt, CĐ1/CĐ2, P3-P8 EN and VI papers, references
- Apply LaTeX math formatting to P7 and P8 EN (residual Unicode → $...$)
- Fix pandoc resource paths for figures (P3-P5 EN/VI; created
  manuscripts/figures/vietnam symlink for P3 figure resolution)
- Rebuild CD1 with -f markdown-yaml_metadata_block to bypass YAML parse error
- Total bundle: 57 files across 6 folders

https://claude.ai/code/session_01TNqoRFY1vAVQL6GWg8X9M3
</commit_message>
<xml_diff>
--- a/dist/HO_SO_NOP/04_BAI_BAO_VI/p6_meta_vi.docx
+++ b/dist/HO_SO_NOP/04_BAI_BAO_VI/p6_meta_vi.docx
@@ -18137,7 +18137,7 @@
     <w:bookmarkEnd w:id="63"/>
     <w:sectPr>
       <w:pgSz w:h="16838" w:w="11906"/>
-      <w:pgMar w:bottom="1134" w:left="1701" w:right="1134" w:top="1134"/>
+      <w:pgMar w:bottom="1417" w:left="1417" w:right="1417" w:top="1417"/>
     </w:sectPr>
   </w:body>
 </w:document>
@@ -18559,13 +18559,13 @@
     <w:name w:val="Normal"/>
     <w:qFormat/>
     <w:pPr>
-      <w:spacing w:line="288" w:lineRule="auto"/>
+      <w:spacing w:line="276" w:lineRule="auto"/>
       <w:jc w:val="both"/>
     </w:pPr>
     <w:rPr>
       <w:rFonts w:ascii="Times New Roman" w:eastAsia="Times New Roman" w:hAnsi="Times New Roman"/>
       <w:color w:val="000000"/>
-      <w:sz w:val="26"/>
+      <w:sz w:val="24"/>
     </w:rPr>
   </w:style>
   <w:style w:styleId="BodyText" w:type="paragraph">
@@ -18573,14 +18573,14 @@
     <w:basedOn w:val="Normal"/>
     <w:link w:val="BodyTextChar"/>
     <w:pPr>
-      <w:spacing w:after="180" w:before="180" w:line="288" w:lineRule="auto"/>
+      <w:spacing w:after="180" w:before="180" w:line="276" w:lineRule="auto"/>
       <w:jc w:val="both"/>
     </w:pPr>
     <w:qFormat/>
     <w:rPr>
       <w:rFonts w:ascii="Times New Roman" w:eastAsia="Times New Roman" w:hAnsi="Times New Roman"/>
       <w:color w:val="000000"/>
-      <w:sz w:val="26"/>
+      <w:sz w:val="24"/>
     </w:rPr>
   </w:style>
   <w:style w:customStyle="1" w:styleId="FirstParagraph" w:type="paragraph">
@@ -18589,13 +18589,13 @@
     <w:next w:val="BodyText"/>
     <w:qFormat/>
     <w:pPr>
-      <w:spacing w:line="288" w:lineRule="auto"/>
+      <w:spacing w:line="276" w:lineRule="auto"/>
       <w:jc w:val="both"/>
     </w:pPr>
     <w:rPr>
       <w:rFonts w:ascii="Times New Roman" w:eastAsia="Times New Roman" w:hAnsi="Times New Roman"/>
       <w:color w:val="000000"/>
-      <w:sz w:val="26"/>
+      <w:sz w:val="24"/>
     </w:rPr>
   </w:style>
   <w:style w:customStyle="1" w:styleId="Compact" w:type="paragraph">
@@ -18603,13 +18603,13 @@
     <w:basedOn w:val="BodyText"/>
     <w:qFormat/>
     <w:pPr>
-      <w:spacing w:after="36" w:before="36" w:line="288" w:lineRule="auto"/>
+      <w:spacing w:after="36" w:before="36" w:line="276" w:lineRule="auto"/>
       <w:jc w:val="both"/>
     </w:pPr>
     <w:rPr>
       <w:rFonts w:ascii="Times New Roman" w:eastAsia="Times New Roman" w:hAnsi="Times New Roman"/>
       <w:color w:val="000000"/>
-      <w:sz w:val="26"/>
+      <w:sz w:val="24"/>
     </w:rPr>
   </w:style>
   <w:style w:styleId="Title" w:type="paragraph">
@@ -18620,7 +18620,7 @@
     <w:pPr>
       <w:keepNext/>
       <w:keepLines/>
-      <w:spacing w:after="240" w:before="480" w:line="288" w:lineRule="auto"/>
+      <w:spacing w:after="240" w:before="480" w:line="276" w:lineRule="auto"/>
       <w:jc w:val="both"/>
     </w:pPr>
     <w:rPr>
@@ -18628,7 +18628,7 @@
       <w:b/>
       <w:bCs/>
       <w:color w:val="000000"/>
-      <w:sz w:val="26"/>
+      <w:sz w:val="24"/>
       <w:szCs w:val="36"/>
     </w:rPr>
   </w:style>
@@ -18640,13 +18640,13 @@
     <w:pPr>
       <w:keepNext/>
       <w:keepLines/>
-      <w:spacing w:after="240" w:before="240" w:line="288" w:lineRule="auto"/>
+      <w:spacing w:after="240" w:before="240" w:line="276" w:lineRule="auto"/>
       <w:jc w:val="both"/>
     </w:pPr>
     <w:rPr>
       <w:rFonts w:ascii="Times New Roman" w:eastAsia="Times New Roman" w:hAnsi="Times New Roman"/>
       <w:color w:val="000000"/>
-      <w:sz w:val="26"/>
+      <w:sz w:val="24"/>
       <w:szCs w:val="30"/>
     </w:rPr>
   </w:style>
@@ -18657,13 +18657,13 @@
     <w:pPr>
       <w:keepNext/>
       <w:keepLines/>
-      <w:spacing w:line="288" w:lineRule="auto"/>
+      <w:spacing w:line="276" w:lineRule="auto"/>
       <w:jc w:val="both"/>
     </w:pPr>
     <w:rPr>
       <w:rFonts w:ascii="Times New Roman" w:eastAsia="Times New Roman" w:hAnsi="Times New Roman"/>
       <w:color w:val="000000"/>
-      <w:sz w:val="26"/>
+      <w:sz w:val="24"/>
     </w:rPr>
   </w:style>
   <w:style w:styleId="Date" w:type="paragraph">
@@ -18673,13 +18673,13 @@
     <w:pPr>
       <w:keepNext/>
       <w:keepLines/>
-      <w:spacing w:line="288" w:lineRule="auto"/>
+      <w:spacing w:line="276" w:lineRule="auto"/>
       <w:jc w:val="both"/>
     </w:pPr>
     <w:rPr>
       <w:rFonts w:ascii="Times New Roman" w:eastAsia="Times New Roman" w:hAnsi="Times New Roman"/>
       <w:color w:val="000000"/>
-      <w:sz w:val="26"/>
+      <w:sz w:val="24"/>
     </w:rPr>
   </w:style>
   <w:style w:customStyle="1" w:styleId="AbstractTitle" w:type="paragraph">
@@ -18691,11 +18691,11 @@
       <w:keepNext/>
       <w:keepLines/>
       <w:jc w:val="both"/>
-      <w:spacing w:after="0" w:before="300" w:line="288" w:lineRule="auto"/>
+      <w:spacing w:after="0" w:before="300" w:line="276" w:lineRule="auto"/>
     </w:pPr>
     <w:rPr>
       <w:color w:val="000000"/>
-      <w:sz w:val="26"/>
+      <w:sz w:val="24"/>
       <w:szCs w:val="20"/>
       <w:rFonts w:ascii="Times New Roman" w:eastAsia="Times New Roman" w:hAnsi="Times New Roman"/>
       <w:b/>
@@ -18709,13 +18709,13 @@
     <w:pPr>
       <w:keepNext/>
       <w:keepLines/>
-      <w:spacing w:after="300" w:before="100" w:line="288" w:lineRule="auto"/>
+      <w:spacing w:after="300" w:before="100" w:line="276" w:lineRule="auto"/>
       <w:jc w:val="both"/>
     </w:pPr>
     <w:rPr>
       <w:rFonts w:ascii="Times New Roman" w:eastAsia="Times New Roman" w:hAnsi="Times New Roman"/>
       <w:color w:val="000000"/>
-      <w:sz w:val="26"/>
+      <w:sz w:val="24"/>
       <w:szCs w:val="20"/>
     </w:rPr>
   </w:style>
@@ -18725,13 +18725,13 @@
     <w:next w:val="Bibliography"/>
     <w:qFormat/>
     <w:pPr>
-      <w:spacing w:line="288" w:lineRule="auto"/>
+      <w:spacing w:line="276" w:lineRule="auto"/>
       <w:jc w:val="both"/>
     </w:pPr>
     <w:rPr>
       <w:rFonts w:ascii="Times New Roman" w:eastAsia="Times New Roman" w:hAnsi="Times New Roman"/>
       <w:color w:val="000000"/>
-      <w:sz w:val="26"/>
+      <w:sz w:val="24"/>
     </w:rPr>
   </w:style>
   <w:style w:styleId="Heading1" w:type="paragraph">
@@ -18743,7 +18743,7 @@
     <w:pPr>
       <w:keepNext/>
       <w:keepLines/>
-      <w:spacing w:after="0" w:before="480" w:line="288" w:lineRule="auto"/>
+      <w:spacing w:after="0" w:before="480" w:line="276" w:lineRule="auto"/>
       <w:jc w:val="both"/>
       <w:outlineLvl w:val="0"/>
     </w:pPr>
@@ -18752,7 +18752,7 @@
       <w:b/>
       <w:bCs/>
       <w:color w:val="000000"/>
-      <w:sz w:val="26"/>
+      <w:sz w:val="24"/>
       <w:szCs w:val="32"/>
     </w:rPr>
   </w:style>
@@ -18766,7 +18766,7 @@
     <w:pPr>
       <w:keepNext/>
       <w:keepLines/>
-      <w:spacing w:after="0" w:before="200" w:line="288" w:lineRule="auto"/>
+      <w:spacing w:after="0" w:before="200" w:line="276" w:lineRule="auto"/>
       <w:jc w:val="both"/>
       <w:outlineLvl w:val="1"/>
     </w:pPr>
@@ -18775,7 +18775,7 @@
       <w:b/>
       <w:bCs/>
       <w:color w:val="000000"/>
-      <w:sz w:val="26"/>
+      <w:sz w:val="24"/>
       <w:szCs w:val="28"/>
     </w:rPr>
   </w:style>
@@ -18789,7 +18789,7 @@
     <w:pPr>
       <w:keepNext/>
       <w:keepLines/>
-      <w:spacing w:after="0" w:before="200" w:line="288" w:lineRule="auto"/>
+      <w:spacing w:after="0" w:before="200" w:line="276" w:lineRule="auto"/>
       <w:jc w:val="both"/>
       <w:outlineLvl w:val="2"/>
     </w:pPr>
@@ -18798,7 +18798,7 @@
       <w:b/>
       <w:bCs/>
       <w:color w:val="000000"/>
-      <w:sz w:val="26"/>
+      <w:sz w:val="24"/>
       <w:szCs w:val="24"/>
     </w:rPr>
   </w:style>
@@ -18812,7 +18812,7 @@
     <w:pPr>
       <w:keepNext/>
       <w:keepLines/>
-      <w:spacing w:after="0" w:before="200" w:line="288" w:lineRule="auto"/>
+      <w:spacing w:after="0" w:before="200" w:line="276" w:lineRule="auto"/>
       <w:jc w:val="both"/>
       <w:outlineLvl w:val="3"/>
     </w:pPr>
@@ -18821,7 +18821,7 @@
       <w:i/>
       <w:bCs/>
       <w:color w:val="000000"/>
-      <w:sz w:val="26"/>
+      <w:sz w:val="24"/>
       <w:szCs w:val="24"/>
     </w:rPr>
   </w:style>
@@ -18835,7 +18835,7 @@
     <w:pPr>
       <w:keepNext/>
       <w:keepLines/>
-      <w:spacing w:after="0" w:before="200" w:line="288" w:lineRule="auto"/>
+      <w:spacing w:after="0" w:before="200" w:line="276" w:lineRule="auto"/>
       <w:jc w:val="both"/>
       <w:outlineLvl w:val="4"/>
     </w:pPr>
@@ -18843,7 +18843,7 @@
       <w:rFonts w:ascii="Times New Roman" w:asciiTheme="majorHAnsi" w:cstheme="majorBidi" w:eastAsia="Times New Roman" w:eastAsiaTheme="majorEastAsia" w:hAnsi="Times New Roman" w:hAnsiTheme="majorHAnsi"/>
       <w:iCs/>
       <w:color w:val="000000"/>
-      <w:sz w:val="26"/>
+      <w:sz w:val="24"/>
       <w:szCs w:val="24"/>
     </w:rPr>
   </w:style>
@@ -18857,14 +18857,14 @@
     <w:pPr>
       <w:keepNext/>
       <w:keepLines/>
-      <w:spacing w:after="0" w:before="200" w:line="288" w:lineRule="auto"/>
+      <w:spacing w:after="0" w:before="200" w:line="276" w:lineRule="auto"/>
       <w:jc w:val="both"/>
       <w:outlineLvl w:val="5"/>
     </w:pPr>
     <w:rPr>
       <w:rFonts w:ascii="Times New Roman" w:asciiTheme="majorHAnsi" w:cstheme="majorBidi" w:eastAsia="Times New Roman" w:eastAsiaTheme="majorEastAsia" w:hAnsi="Times New Roman" w:hAnsiTheme="majorHAnsi"/>
       <w:color w:val="000000"/>
-      <w:sz w:val="26"/>
+      <w:sz w:val="24"/>
       <w:szCs w:val="24"/>
     </w:rPr>
   </w:style>
@@ -18878,14 +18878,14 @@
     <w:pPr>
       <w:keepNext/>
       <w:keepLines/>
-      <w:spacing w:after="0" w:before="200" w:line="288" w:lineRule="auto"/>
+      <w:spacing w:after="0" w:before="200" w:line="276" w:lineRule="auto"/>
       <w:jc w:val="both"/>
       <w:outlineLvl w:val="6"/>
     </w:pPr>
     <w:rPr>
       <w:rFonts w:ascii="Times New Roman" w:asciiTheme="majorHAnsi" w:cstheme="majorBidi" w:eastAsia="Times New Roman" w:eastAsiaTheme="majorEastAsia" w:hAnsi="Times New Roman" w:hAnsiTheme="majorHAnsi"/>
       <w:color w:val="000000"/>
-      <w:sz w:val="26"/>
+      <w:sz w:val="24"/>
       <w:szCs w:val="24"/>
     </w:rPr>
   </w:style>
@@ -18899,14 +18899,14 @@
     <w:pPr>
       <w:keepNext/>
       <w:keepLines/>
-      <w:spacing w:after="0" w:before="200" w:line="288" w:lineRule="auto"/>
+      <w:spacing w:after="0" w:before="200" w:line="276" w:lineRule="auto"/>
       <w:jc w:val="both"/>
       <w:outlineLvl w:val="7"/>
     </w:pPr>
     <w:rPr>
       <w:rFonts w:ascii="Times New Roman" w:asciiTheme="majorHAnsi" w:cstheme="majorBidi" w:eastAsia="Times New Roman" w:eastAsiaTheme="majorEastAsia" w:hAnsi="Times New Roman" w:hAnsiTheme="majorHAnsi"/>
       <w:color w:val="000000"/>
-      <w:sz w:val="26"/>
+      <w:sz w:val="24"/>
       <w:szCs w:val="24"/>
     </w:rPr>
   </w:style>
@@ -18920,14 +18920,14 @@
     <w:pPr>
       <w:keepNext/>
       <w:keepLines/>
-      <w:spacing w:after="0" w:before="200" w:line="288" w:lineRule="auto"/>
+      <w:spacing w:after="0" w:before="200" w:line="276" w:lineRule="auto"/>
       <w:jc w:val="both"/>
       <w:outlineLvl w:val="8"/>
     </w:pPr>
     <w:rPr>
       <w:rFonts w:ascii="Times New Roman" w:asciiTheme="majorHAnsi" w:cstheme="majorBidi" w:eastAsia="Times New Roman" w:eastAsiaTheme="majorEastAsia" w:hAnsi="Times New Roman" w:hAnsiTheme="majorHAnsi"/>
       <w:color w:val="000000"/>
-      <w:sz w:val="26"/>
+      <w:sz w:val="24"/>
       <w:szCs w:val="24"/>
     </w:rPr>
   </w:style>
@@ -18939,14 +18939,14 @@
     <w:unhideWhenUsed/>
     <w:qFormat/>
     <w:pPr>
-      <w:spacing w:after="100" w:before="100" w:line="288" w:lineRule="auto"/>
+      <w:spacing w:after="100" w:before="100" w:line="276" w:lineRule="auto"/>
       <w:ind w:firstLine="0" w:left="480" w:right="480"/>
       <w:jc w:val="both"/>
     </w:pPr>
     <w:rPr>
       <w:rFonts w:ascii="Times New Roman" w:eastAsia="Times New Roman" w:hAnsi="Times New Roman"/>
       <w:color w:val="000000"/>
-      <w:sz w:val="26"/>
+      <w:sz w:val="24"/>
     </w:rPr>
   </w:style>
   <w:style w:styleId="FootnoteText" w:type="paragraph">
@@ -18957,13 +18957,13 @@
     <w:unhideWhenUsed/>
     <w:qFormat/>
     <w:pPr>
-      <w:spacing w:line="288" w:lineRule="auto"/>
+      <w:spacing w:line="276" w:lineRule="auto"/>
       <w:jc w:val="both"/>
     </w:pPr>
     <w:rPr>
       <w:rFonts w:ascii="Times New Roman" w:eastAsia="Times New Roman" w:hAnsi="Times New Roman"/>
       <w:color w:val="000000"/>
-      <w:sz w:val="26"/>
+      <w:sz w:val="24"/>
     </w:rPr>
   </w:style>
   <w:style w:default="1" w:styleId="DefaultParagraphFont" w:type="character">
@@ -18973,7 +18973,7 @@
     <w:rPr>
       <w:rFonts w:ascii="Times New Roman" w:eastAsia="Times New Roman" w:hAnsi="Times New Roman"/>
       <w:color w:val="000000"/>
-      <w:sz w:val="26"/>
+      <w:sz w:val="24"/>
     </w:rPr>
   </w:style>
   <w:style w:default="1" w:styleId="Table" w:type="table">
@@ -18983,13 +18983,13 @@
     <w:unhideWhenUsed/>
     <w:qFormat/>
     <w:pPr>
-      <w:spacing w:line="288" w:lineRule="auto"/>
+      <w:spacing w:line="276" w:lineRule="auto"/>
       <w:jc w:val="both"/>
     </w:pPr>
     <w:rPr>
       <w:rFonts w:ascii="Times New Roman" w:eastAsia="Times New Roman" w:hAnsi="Times New Roman"/>
       <w:color w:val="000000"/>
-      <w:sz w:val="26"/>
+      <w:sz w:val="24"/>
     </w:rPr>
     <w:tblPr>
       <w:tblInd w:type="dxa" w:w="0"/>
@@ -19023,27 +19023,27 @@
     <w:pPr>
       <w:keepNext/>
       <w:keepLines/>
-      <w:spacing w:after="0" w:line="288" w:lineRule="auto"/>
+      <w:spacing w:after="0" w:line="276" w:lineRule="auto"/>
       <w:jc w:val="both"/>
     </w:pPr>
     <w:rPr>
       <w:rFonts w:ascii="Times New Roman" w:eastAsia="Times New Roman" w:hAnsi="Times New Roman"/>
       <w:b/>
       <w:color w:val="000000"/>
-      <w:sz w:val="26"/>
+      <w:sz w:val="24"/>
     </w:rPr>
   </w:style>
   <w:style w:customStyle="1" w:styleId="Definition" w:type="paragraph">
     <w:name w:val="Definition"/>
     <w:basedOn w:val="Normal"/>
     <w:pPr>
-      <w:spacing w:line="288" w:lineRule="auto"/>
+      <w:spacing w:line="276" w:lineRule="auto"/>
       <w:jc w:val="both"/>
     </w:pPr>
     <w:rPr>
       <w:rFonts w:ascii="Times New Roman" w:eastAsia="Times New Roman" w:hAnsi="Times New Roman"/>
       <w:color w:val="000000"/>
-      <w:sz w:val="26"/>
+      <w:sz w:val="24"/>
     </w:rPr>
   </w:style>
   <w:style w:styleId="Caption" w:type="paragraph">
@@ -19051,14 +19051,14 @@
     <w:basedOn w:val="Normal"/>
     <w:link w:val="BodyTextChar"/>
     <w:pPr>
-      <w:spacing w:after="120" w:before="0" w:line="288" w:lineRule="auto"/>
+      <w:spacing w:after="120" w:before="0" w:line="276" w:lineRule="auto"/>
       <w:jc w:val="both"/>
     </w:pPr>
     <w:rPr>
       <w:rFonts w:ascii="Times New Roman" w:eastAsia="Times New Roman" w:hAnsi="Times New Roman"/>
       <w:i/>
       <w:color w:val="000000"/>
-      <w:sz w:val="26"/>
+      <w:sz w:val="24"/>
     </w:rPr>
   </w:style>
   <w:style w:customStyle="1" w:styleId="TableCaption" w:type="paragraph">
@@ -19066,39 +19066,39 @@
     <w:basedOn w:val="Caption"/>
     <w:pPr>
       <w:keepNext/>
-      <w:spacing w:line="288" w:lineRule="auto"/>
+      <w:spacing w:line="276" w:lineRule="auto"/>
       <w:jc w:val="both"/>
     </w:pPr>
     <w:rPr>
       <w:rFonts w:ascii="Times New Roman" w:eastAsia="Times New Roman" w:hAnsi="Times New Roman"/>
       <w:color w:val="000000"/>
-      <w:sz w:val="26"/>
+      <w:sz w:val="24"/>
     </w:rPr>
   </w:style>
   <w:style w:customStyle="1" w:styleId="ImageCaption" w:type="paragraph">
     <w:name w:val="Image Caption"/>
     <w:basedOn w:val="Caption"/>
     <w:pPr>
-      <w:spacing w:line="288" w:lineRule="auto"/>
+      <w:spacing w:line="276" w:lineRule="auto"/>
       <w:jc w:val="both"/>
     </w:pPr>
     <w:rPr>
       <w:rFonts w:ascii="Times New Roman" w:eastAsia="Times New Roman" w:hAnsi="Times New Roman"/>
       <w:color w:val="000000"/>
-      <w:sz w:val="26"/>
+      <w:sz w:val="24"/>
     </w:rPr>
   </w:style>
   <w:style w:customStyle="1" w:styleId="Figure" w:type="paragraph">
     <w:name w:val="Figure"/>
     <w:basedOn w:val="Normal"/>
     <w:pPr>
-      <w:spacing w:line="288" w:lineRule="auto"/>
+      <w:spacing w:line="276" w:lineRule="auto"/>
       <w:jc w:val="both"/>
     </w:pPr>
     <w:rPr>
       <w:rFonts w:ascii="Times New Roman" w:eastAsia="Times New Roman" w:hAnsi="Times New Roman"/>
       <w:color w:val="000000"/>
-      <w:sz w:val="26"/>
+      <w:sz w:val="24"/>
     </w:rPr>
   </w:style>
   <w:style w:customStyle="1" w:styleId="CaptionedFigure" w:type="paragraph">
@@ -19106,13 +19106,13 @@
     <w:basedOn w:val="Figure"/>
     <w:pPr>
       <w:keepNext/>
-      <w:spacing w:line="288" w:lineRule="auto"/>
+      <w:spacing w:line="276" w:lineRule="auto"/>
       <w:jc w:val="both"/>
     </w:pPr>
     <w:rPr>
       <w:rFonts w:ascii="Times New Roman" w:eastAsia="Times New Roman" w:hAnsi="Times New Roman"/>
       <w:color w:val="000000"/>
-      <w:sz w:val="26"/>
+      <w:sz w:val="24"/>
     </w:rPr>
   </w:style>
   <w:style w:customStyle="1" w:styleId="BodyTextChar" w:type="character">
@@ -19122,7 +19122,7 @@
     <w:rPr>
       <w:rFonts w:ascii="Times New Roman" w:eastAsia="Times New Roman" w:hAnsi="Times New Roman"/>
       <w:color w:val="000000"/>
-      <w:sz w:val="26"/>
+      <w:sz w:val="24"/>
     </w:rPr>
   </w:style>
   <w:style w:customStyle="1" w:styleId="VerbatimChar" w:type="character">
@@ -19131,7 +19131,7 @@
     <w:rPr>
       <w:rFonts w:ascii="Times New Roman" w:eastAsia="Times New Roman" w:hAnsi="Times New Roman"/>
       <w:color w:val="000000"/>
-      <w:sz w:val="26"/>
+      <w:sz w:val="24"/>
     </w:rPr>
   </w:style>
   <w:style w:customStyle="1" w:styleId="SectionNumber" w:type="character">
@@ -19140,7 +19140,7 @@
     <w:rPr>
       <w:rFonts w:ascii="Times New Roman" w:eastAsia="Times New Roman" w:hAnsi="Times New Roman"/>
       <w:color w:val="000000"/>
-      <w:sz w:val="26"/>
+      <w:sz w:val="24"/>
     </w:rPr>
   </w:style>
   <w:style w:styleId="FootnoteReference" w:type="character">
@@ -19149,7 +19149,7 @@
     <w:rPr>
       <w:rFonts w:ascii="Times New Roman" w:eastAsia="Times New Roman" w:hAnsi="Times New Roman"/>
       <w:color w:val="000000"/>
-      <w:sz w:val="26"/>
+      <w:sz w:val="24"/>
       <w:vertAlign w:val="superscript"/>
     </w:rPr>
   </w:style>
@@ -19159,7 +19159,7 @@
     <w:rPr>
       <w:rFonts w:ascii="Times New Roman" w:eastAsia="Times New Roman" w:hAnsi="Times New Roman"/>
       <w:color w:val="000000"/>
-      <w:sz w:val="26"/>
+      <w:sz w:val="24"/>
     </w:rPr>
   </w:style>
   <w:style w:styleId="TOCHeading" w:type="paragraph">
@@ -19170,7 +19170,7 @@
     <w:unhideWhenUsed/>
     <w:qFormat/>
     <w:pPr>
-      <w:spacing w:before="240" w:line="288" w:lineRule="auto"/>
+      <w:spacing w:before="240" w:line="276" w:lineRule="auto"/>
       <w:jc w:val="both"/>
       <w:outlineLvl w:val="9"/>
     </w:pPr>
@@ -19179,7 +19179,7 @@
       <w:b w:val="0"/>
       <w:bCs w:val="0"/>
       <w:color w:val="000000"/>
-      <w:sz w:val="26"/>
+      <w:sz w:val="24"/>
     </w:rPr>
   </w:style>
   <w:style w:type="paragraph" w:customStyle="1" w:styleId="SourceCode">

</xml_diff>